<commit_message>
Itemize production materials and system equipment in quotation
- 제작물: 자료집(혹은 리플릿)·시나리오 큐카드·현수막·배너·폼보드·마이크택·명패·명찰·사전 티타임 개별 항목화
- 시스템: 노트북·프린터 임차 및 접수 소모품 반영
- 업무분장표 동기화 (마마미디어 VAT 포함 18,190,000원 유지)

Co-Authored-By: Claude Opus 5.5 <noreply@anthropic.com>
Claude-Session: https://claude.ai/code/session_018WmVGxh2eujqtEGBBBdyNp
</commit_message>
<xml_diff>
--- a/2026_취약노동자원탁회의_결과보고회/업무분장표_마마미디어_코리아스픽스.docx
+++ b/2026_취약노동자원탁회의_결과보고회/업무분장표_마마미디어_코리아스픽스.docx
@@ -54,7 +54,7 @@
         <w:pStyle w:val="ListBullet"/>
       </w:pPr>
       <w:r>
-        <w:t>코리아스픽스(계약 주체): 노사발전재단과의 계약·협의·보고 창구, 사업 총괄, 참가자 모집·관리 및 수당서류, 콘텐츠(자료집·시나리오), 현장 접수.</w:t>
+        <w:t>코리아스픽스(계약 주체): 노사발전재단과의 계약·협의·보고 창구, 사업 총괄, 참가자 모집·관리 및 수당서류, 콘텐츠(자료집·시나리오 큐카드), 마이크택·명패·명찰, 사전 티타임, 접수 시스템(노트북·프린터).</w:t>
       </w:r>
     </w:p>
     <w:p>
@@ -62,7 +62,7 @@
         <w:pStyle w:val="ListBullet"/>
       </w:pPr>
       <w:r>
-        <w:t>마마미디어(제작·기술 협력사): 행사장 조성, 음향·영상 기술, 디자인·인쇄물, 사진·영상 촬영·편집, 현장 운영 PM·보조, 다과, 제작·기술 인력 출장·운송.</w:t>
+        <w:t>마마미디어(제작·기술 협력사): 행사장 조성, 음향·영상 기술, 키비주얼·현수막·배너·폼보드, 사진·영상 촬영·편집, 현장 운영 PM·보조, 참석자 다과, 제작·기술 인력 출장·운송.</w:t>
       </w:r>
     </w:p>
     <w:p>
@@ -612,7 +612,7 @@
           </w:tcPr>
           <w:p>
             <w:r>
-              <w:t>행사장 조성</w:t>
+              <w:t>시스템</w:t>
             </w:r>
           </w:p>
         </w:tc>
@@ -622,7 +622,121 @@
           </w:tcPr>
           <w:p>
             <w:r>
-              <w:t>접수 동선 셋팅, 노트북·프린터 등 접수 기자재</w:t>
+              <w:t>노트북 임차(발표 송출용·접수용 각 1대)</w:t>
+            </w:r>
+          </w:p>
+        </w:tc>
+        <w:tc>
+          <w:tcPr>
+            <w:tcW w:type="dxa" w:w="1134"/>
+          </w:tcPr>
+          <w:p>
+            <w:pPr>
+              <w:jc w:val="center"/>
+            </w:pPr>
+            <w:r>
+              <w:t>○</w:t>
+            </w:r>
+          </w:p>
+        </w:tc>
+        <w:tc>
+          <w:tcPr>
+            <w:tcW w:type="dxa" w:w="1247"/>
+          </w:tcPr>
+          <w:p>
+            <w:pPr>
+              <w:jc w:val="center"/>
+            </w:pPr>
+            <w:r>
+              <w:t>●</w:t>
+            </w:r>
+          </w:p>
+        </w:tc>
+        <w:tc>
+          <w:tcPr>
+            <w:tcW w:type="dxa" w:w="2494"/>
+          </w:tcPr>
+          <w:p>
+            <w:r>
+              <w:t>발표 송출 연결은 영상오퍼레이터 협조</w:t>
+            </w:r>
+          </w:p>
+        </w:tc>
+      </w:tr>
+      <w:tr>
+        <w:tc>
+          <w:tcPr>
+            <w:tcW w:type="dxa" w:w="1361"/>
+          </w:tcPr>
+          <w:p>
+            <w:r>
+              <w:t>시스템</w:t>
+            </w:r>
+          </w:p>
+        </w:tc>
+        <w:tc>
+          <w:tcPr>
+            <w:tcW w:type="dxa" w:w="3969"/>
+          </w:tcPr>
+          <w:p>
+            <w:r>
+              <w:t>프린터 임차(현장 출력·명찰 재출력)</w:t>
+            </w:r>
+          </w:p>
+        </w:tc>
+        <w:tc>
+          <w:tcPr>
+            <w:tcW w:type="dxa" w:w="1134"/>
+          </w:tcPr>
+          <w:p>
+            <w:pPr>
+              <w:jc w:val="center"/>
+            </w:pPr>
+            <w:r>
+              <w:t>-</w:t>
+            </w:r>
+          </w:p>
+        </w:tc>
+        <w:tc>
+          <w:tcPr>
+            <w:tcW w:type="dxa" w:w="1247"/>
+          </w:tcPr>
+          <w:p>
+            <w:pPr>
+              <w:jc w:val="center"/>
+            </w:pPr>
+            <w:r>
+              <w:t>●</w:t>
+            </w:r>
+          </w:p>
+        </w:tc>
+        <w:tc>
+          <w:tcPr>
+            <w:tcW w:type="dxa" w:w="2494"/>
+          </w:tcPr>
+          <w:p>
+            <w:r/>
+          </w:p>
+        </w:tc>
+      </w:tr>
+      <w:tr>
+        <w:tc>
+          <w:tcPr>
+            <w:tcW w:type="dxa" w:w="1361"/>
+          </w:tcPr>
+          <w:p>
+            <w:r>
+              <w:t>시스템</w:t>
+            </w:r>
+          </w:p>
+        </w:tc>
+        <w:tc>
+          <w:tcPr>
+            <w:tcW w:type="dxa" w:w="3969"/>
+          </w:tcPr>
+          <w:p>
+            <w:r>
+              <w:t>접수 동선 셋팅, 접수대 비품·소모품</w:t>
             </w:r>
           </w:p>
         </w:tc>
@@ -736,7 +850,7 @@
           </w:tcPr>
           <w:p>
             <w:r>
-              <w:t>현수막·X배너·폼보드</w:t>
+              <w:t>현수막</w:t>
             </w:r>
           </w:p>
         </w:tc>
@@ -794,7 +908,119 @@
           </w:tcPr>
           <w:p>
             <w:r>
-              <w:t>행사 자료집(리플릿) 원고 취합·편집·인쇄</w:t>
+              <w:t>배너(X배너)</w:t>
+            </w:r>
+          </w:p>
+        </w:tc>
+        <w:tc>
+          <w:tcPr>
+            <w:tcW w:type="dxa" w:w="1134"/>
+          </w:tcPr>
+          <w:p>
+            <w:pPr>
+              <w:jc w:val="center"/>
+            </w:pPr>
+            <w:r>
+              <w:t>●</w:t>
+            </w:r>
+          </w:p>
+        </w:tc>
+        <w:tc>
+          <w:tcPr>
+            <w:tcW w:type="dxa" w:w="1247"/>
+          </w:tcPr>
+          <w:p>
+            <w:pPr>
+              <w:jc w:val="center"/>
+            </w:pPr>
+            <w:r>
+              <w:t>○</w:t>
+            </w:r>
+          </w:p>
+        </w:tc>
+        <w:tc>
+          <w:tcPr>
+            <w:tcW w:type="dxa" w:w="2494"/>
+          </w:tcPr>
+          <w:p>
+            <w:r/>
+          </w:p>
+        </w:tc>
+      </w:tr>
+      <w:tr>
+        <w:tc>
+          <w:tcPr>
+            <w:tcW w:type="dxa" w:w="1361"/>
+          </w:tcPr>
+          <w:p>
+            <w:r>
+              <w:t>제작물</w:t>
+            </w:r>
+          </w:p>
+        </w:tc>
+        <w:tc>
+          <w:tcPr>
+            <w:tcW w:type="dxa" w:w="3969"/>
+          </w:tcPr>
+          <w:p>
+            <w:r>
+              <w:t>폼보드(안내·포토존)</w:t>
+            </w:r>
+          </w:p>
+        </w:tc>
+        <w:tc>
+          <w:tcPr>
+            <w:tcW w:type="dxa" w:w="1134"/>
+          </w:tcPr>
+          <w:p>
+            <w:pPr>
+              <w:jc w:val="center"/>
+            </w:pPr>
+            <w:r>
+              <w:t>●</w:t>
+            </w:r>
+          </w:p>
+        </w:tc>
+        <w:tc>
+          <w:tcPr>
+            <w:tcW w:type="dxa" w:w="1247"/>
+          </w:tcPr>
+          <w:p>
+            <w:pPr>
+              <w:jc w:val="center"/>
+            </w:pPr>
+            <w:r>
+              <w:t>○</w:t>
+            </w:r>
+          </w:p>
+        </w:tc>
+        <w:tc>
+          <w:tcPr>
+            <w:tcW w:type="dxa" w:w="2494"/>
+          </w:tcPr>
+          <w:p>
+            <w:r/>
+          </w:p>
+        </w:tc>
+      </w:tr>
+      <w:tr>
+        <w:tc>
+          <w:tcPr>
+            <w:tcW w:type="dxa" w:w="1361"/>
+          </w:tcPr>
+          <w:p>
+            <w:r>
+              <w:t>제작물</w:t>
+            </w:r>
+          </w:p>
+        </w:tc>
+        <w:tc>
+          <w:tcPr>
+            <w:tcW w:type="dxa" w:w="3969"/>
+          </w:tcPr>
+          <w:p>
+            <w:r>
+              <w:t>행사 자료집(혹은 리플릿) 원고 취합·편집·인쇄</w:t>
             </w:r>
           </w:p>
         </w:tc>
@@ -908,7 +1134,7 @@
           </w:tcPr>
           <w:p>
             <w:r>
-              <w:t>명패·명찰·마이크택</w:t>
+              <w:t>마이크택</w:t>
             </w:r>
           </w:p>
         </w:tc>
@@ -966,7 +1192,65 @@
           </w:tcPr>
           <w:p>
             <w:r>
-              <w:t>다과·생수, 사전 티타임 준비(각 50명)</w:t>
+              <w:t>명패·명찰</w:t>
+            </w:r>
+          </w:p>
+        </w:tc>
+        <w:tc>
+          <w:tcPr>
+            <w:tcW w:type="dxa" w:w="1134"/>
+          </w:tcPr>
+          <w:p>
+            <w:pPr>
+              <w:jc w:val="center"/>
+            </w:pPr>
+            <w:r>
+              <w:t>○</w:t>
+            </w:r>
+          </w:p>
+        </w:tc>
+        <w:tc>
+          <w:tcPr>
+            <w:tcW w:type="dxa" w:w="1247"/>
+          </w:tcPr>
+          <w:p>
+            <w:pPr>
+              <w:jc w:val="center"/>
+            </w:pPr>
+            <w:r>
+              <w:t>●</w:t>
+            </w:r>
+          </w:p>
+        </w:tc>
+        <w:tc>
+          <w:tcPr>
+            <w:tcW w:type="dxa" w:w="2494"/>
+          </w:tcPr>
+          <w:p>
+            <w:r>
+              <w:t>명단 확정 후 출력</w:t>
+            </w:r>
+          </w:p>
+        </w:tc>
+      </w:tr>
+      <w:tr>
+        <w:tc>
+          <w:tcPr>
+            <w:tcW w:type="dxa" w:w="1361"/>
+          </w:tcPr>
+          <w:p>
+            <w:r>
+              <w:t>제작물</w:t>
+            </w:r>
+          </w:p>
+        </w:tc>
+        <w:tc>
+          <w:tcPr>
+            <w:tcW w:type="dxa" w:w="3969"/>
+          </w:tcPr>
+          <w:p>
+            <w:r>
+              <w:t>참석자 다과·생수(각 50명)</w:t>
             </w:r>
           </w:p>
         </w:tc>
@@ -1004,6 +1288,62 @@
             <w:r>
               <w:t>인원 확정은 코리아스픽스</w:t>
             </w:r>
+          </w:p>
+        </w:tc>
+      </w:tr>
+      <w:tr>
+        <w:tc>
+          <w:tcPr>
+            <w:tcW w:type="dxa" w:w="1361"/>
+          </w:tcPr>
+          <w:p>
+            <w:r>
+              <w:t>제작물</w:t>
+            </w:r>
+          </w:p>
+        </w:tc>
+        <w:tc>
+          <w:tcPr>
+            <w:tcW w:type="dxa" w:w="3969"/>
+          </w:tcPr>
+          <w:p>
+            <w:r>
+              <w:t>사전 티타임 준비(내빈·발제자 10명 내외)</w:t>
+            </w:r>
+          </w:p>
+        </w:tc>
+        <w:tc>
+          <w:tcPr>
+            <w:tcW w:type="dxa" w:w="1134"/>
+          </w:tcPr>
+          <w:p>
+            <w:pPr>
+              <w:jc w:val="center"/>
+            </w:pPr>
+            <w:r>
+              <w:t>○</w:t>
+            </w:r>
+          </w:p>
+        </w:tc>
+        <w:tc>
+          <w:tcPr>
+            <w:tcW w:type="dxa" w:w="1247"/>
+          </w:tcPr>
+          <w:p>
+            <w:pPr>
+              <w:jc w:val="center"/>
+            </w:pPr>
+            <w:r>
+              <w:t>●</w:t>
+            </w:r>
+          </w:p>
+        </w:tc>
+        <w:tc>
+          <w:tcPr>
+            <w:tcW w:type="dxa" w:w="2494"/>
+          </w:tcPr>
+          <w:p>
+            <w:r/>
           </w:p>
         </w:tc>
       </w:tr>
@@ -1769,7 +2109,7 @@
           </w:tcPr>
           <w:p>
             <w:r>
-              <w:t>직접수행 항목(총괄·참가자관리·자료집·시나리오·명패명찰·접수·출장)</w:t>
+              <w:t>직접수행 항목(총괄·노트북·프린터·자료집·시나리오·마이크택·명패·명찰·티타임·접수·참가자관리·출장)</w:t>
             </w:r>
           </w:p>
         </w:tc>
@@ -1779,7 +2119,7 @@
           </w:tcPr>
           <w:p>
             <w:r>
-              <w:t>8,600,000원 (VAT 별도)</w:t>
+              <w:t>9,530,000원 (VAT 별도)</w:t>
             </w:r>
           </w:p>
         </w:tc>
@@ -1801,7 +2141,7 @@
           </w:tcPr>
           <w:p>
             <w:r>
-              <w:t>직접비 26,790,000 + 일반관리비 5% + 기업이윤 5%, 공급가액 만원 미만 절사</w:t>
+              <w:t>직접비 27,720,000 + 일반관리비 5% + 기업이윤 5%, 공급가액 만원 미만 절사</w:t>
             </w:r>
           </w:p>
         </w:tc>
@@ -1811,7 +2151,7 @@
           </w:tcPr>
           <w:p>
             <w:r>
-              <w:t>29,530,000원 + VAT = 32,483,000원</w:t>
+              <w:t>30,560,000원 + VAT = 33,616,000원</w:t>
             </w:r>
           </w:p>
         </w:tc>

</xml_diff>

<commit_message>
Split quotation amounts by performing unit (마마미디어/지혜의영토)
- 수행단위별 금액 열 추가, 섹션 소계·직접비·공급가액·총계 단위별 산출
- 제작물 전 항목 마마미디어 담당으로 이관 (VAT 포함 기준)
- 지혜의영토 인건비(총괄책임자·기획운영·참가자관리) 반영
- 업무분장표 동기화

Co-Authored-By: Claude Opus 5.5 <noreply@anthropic.com>
Claude-Session: https://claude.ai/code/session_018WmVGxh2eujqtEGBBBdyNp
</commit_message>
<xml_diff>
--- a/2026_취약노동자원탁회의_결과보고회/업무분장표_마마미디어_코리아스픽스.docx
+++ b/2026_취약노동자원탁회의_결과보고회/업무분장표_마마미디어_코리아스픽스.docx
@@ -54,7 +54,7 @@
         <w:pStyle w:val="ListBullet"/>
       </w:pPr>
       <w:r>
-        <w:t>코리아스픽스(계약 주체): 노사발전재단과의 계약·협의·보고 창구, 사업 총괄, 참가자 모집·관리 및 수당서류, 콘텐츠(자료집·시나리오 큐카드), 마이크택·명패·명찰, 사전 티타임, 접수 시스템(노트북·프린터).</w:t>
+        <w:t>코리아스픽스(계약 주체): 노사발전재단과의 계약·협의·보고 창구, 사업 총괄, 참가자 모집·관리 및 수당서류, 자료집 원고·참석자 명단 제공, 현장 접수 및 접수 시스템(노트북·프린터).</w:t>
       </w:r>
     </w:p>
     <w:p>
@@ -62,7 +62,7 @@
         <w:pStyle w:val="ListBullet"/>
       </w:pPr>
       <w:r>
-        <w:t>마마미디어(제작·기술 협력사): 행사장 조성, 음향·영상 기술, 키비주얼·현수막·배너·폼보드, 사진·영상 촬영·편집, 현장 운영 PM·보조, 참석자 다과, 제작·기술 인력 출장·운송.</w:t>
+        <w:t>마마미디어(제작·기술 협력사): 행사장 조성, 음향·영상 기술, 제작물 전반(키비주얼·자료집·시나리오 큐카드·현수막·배너·폼보드·마이크택·명패·명찰·다과·사전 티타임), 사진·영상 촬영·편집, 현장 운영 PM·보조, 제작·기술 인력 출장·운송.</w:t>
       </w:r>
     </w:p>
     <w:p>
@@ -1020,7 +1020,7 @@
           </w:tcPr>
           <w:p>
             <w:r>
-              <w:t>행사 자료집(혹은 리플릿) 원고 취합·편집·인쇄</w:t>
+              <w:t>행사 자료집(혹은 리플릿) 편집·인쇄</w:t>
             </w:r>
           </w:p>
         </w:tc>
@@ -1033,7 +1033,7 @@
               <w:jc w:val="center"/>
             </w:pPr>
             <w:r>
-              <w:t>○</w:t>
+              <w:t>●</w:t>
             </w:r>
           </w:p>
         </w:tc>
@@ -1046,7 +1046,7 @@
               <w:jc w:val="center"/>
             </w:pPr>
             <w:r>
-              <w:t>●</w:t>
+              <w:t>○</w:t>
             </w:r>
           </w:p>
         </w:tc>
@@ -1056,7 +1056,7 @@
           </w:tcPr>
           <w:p>
             <w:r>
-              <w:t>마마미디어: 키비주얼 적용 협조</w:t>
+              <w:t>원고 취합·검수 코리아스픽스 협조</w:t>
             </w:r>
           </w:p>
         </w:tc>
@@ -1091,7 +1091,7 @@
               <w:jc w:val="center"/>
             </w:pPr>
             <w:r>
-              <w:t>-</w:t>
+              <w:t>●</w:t>
             </w:r>
           </w:p>
         </w:tc>
@@ -1104,7 +1104,7 @@
               <w:jc w:val="center"/>
             </w:pPr>
             <w:r>
-              <w:t>●</w:t>
+              <w:t>○</w:t>
             </w:r>
           </w:p>
         </w:tc>
@@ -1113,7 +1113,9 @@
             <w:tcW w:type="dxa" w:w="2494"/>
           </w:tcPr>
           <w:p>
-            <w:r/>
+            <w:r>
+              <w:t>진행 내용·순서 코리아스픽스 제공</w:t>
+            </w:r>
           </w:p>
         </w:tc>
       </w:tr>
@@ -1147,7 +1149,7 @@
               <w:jc w:val="center"/>
             </w:pPr>
             <w:r>
-              <w:t>○</w:t>
+              <w:t>●</w:t>
             </w:r>
           </w:p>
         </w:tc>
@@ -1160,7 +1162,7 @@
               <w:jc w:val="center"/>
             </w:pPr>
             <w:r>
-              <w:t>●</w:t>
+              <w:t>-</w:t>
             </w:r>
           </w:p>
         </w:tc>
@@ -1169,9 +1171,7 @@
             <w:tcW w:type="dxa" w:w="2494"/>
           </w:tcPr>
           <w:p>
-            <w:r>
-              <w:t>디자인 톤 마마미디어 협조</w:t>
-            </w:r>
+            <w:r/>
           </w:p>
         </w:tc>
       </w:tr>
@@ -1205,7 +1205,7 @@
               <w:jc w:val="center"/>
             </w:pPr>
             <w:r>
-              <w:t>○</w:t>
+              <w:t>●</w:t>
             </w:r>
           </w:p>
         </w:tc>
@@ -1218,7 +1218,7 @@
               <w:jc w:val="center"/>
             </w:pPr>
             <w:r>
-              <w:t>●</w:t>
+              <w:t>○</w:t>
             </w:r>
           </w:p>
         </w:tc>
@@ -1228,7 +1228,7 @@
           </w:tcPr>
           <w:p>
             <w:r>
-              <w:t>명단 확정 후 출력</w:t>
+              <w:t>참석자 명단 코리아스픽스 제공</w:t>
             </w:r>
           </w:p>
         </w:tc>
@@ -1321,7 +1321,7 @@
               <w:jc w:val="center"/>
             </w:pPr>
             <w:r>
-              <w:t>○</w:t>
+              <w:t>●</w:t>
             </w:r>
           </w:p>
         </w:tc>
@@ -1334,7 +1334,7 @@
               <w:jc w:val="center"/>
             </w:pPr>
             <w:r>
-              <w:t>●</w:t>
+              <w:t>○</w:t>
             </w:r>
           </w:p>
         </w:tc>
@@ -1343,7 +1343,9 @@
             <w:tcW w:type="dxa" w:w="2494"/>
           </w:tcPr>
           <w:p>
-            <w:r/>
+            <w:r>
+              <w:t>내빈 명단 코리아스픽스 제공</w:t>
+            </w:r>
           </w:p>
         </w:tc>
       </w:tr>
@@ -2077,7 +2079,7 @@
           </w:tcPr>
           <w:p>
             <w:r>
-              <w:t>통합견적(2회 합산) — 재단 견적에 VAT 포함 금액 기준으로 반영</w:t>
+              <w:t>통합견적 18,190,000원(VAT 포함) + 이관 제작물 2,717,000원(VAT 포함, 추정) — 마마미디어 재견적 필요</w:t>
             </w:r>
           </w:p>
         </w:tc>
@@ -2087,7 +2089,7 @@
           </w:tcPr>
           <w:p>
             <w:r>
-              <w:t>18,190,000원 (VAT 포함)</w:t>
+              <w:t>20,907,000원 (VAT 포함 기준)</w:t>
             </w:r>
           </w:p>
         </w:tc>
@@ -2109,7 +2111,7 @@
           </w:tcPr>
           <w:p>
             <w:r>
-              <w:t>직접수행 항목(총괄·노트북·프린터·자료집·시나리오·마이크택·명패·명찰·티타임·접수·참가자관리·출장)</w:t>
+              <w:t>인건비(총괄책임자·기획운영·참가자관리) 6,400,000 + 시스템·접수·홍보·출장 2,460,000</w:t>
             </w:r>
           </w:p>
         </w:tc>
@@ -2119,7 +2121,7 @@
           </w:tcPr>
           <w:p>
             <w:r>
-              <w:t>9,530,000원 (VAT 별도)</w:t>
+              <w:t>8,860,000원 (VAT 별도)</w:t>
             </w:r>
           </w:p>
         </w:tc>
@@ -2141,7 +2143,7 @@
           </w:tcPr>
           <w:p>
             <w:r>
-              <w:t>직접비 27,720,000 + 일반관리비 5% + 기업이윤 5%, 공급가액 만원 미만 절사</w:t>
+              <w:t>직접비 29,767,000 + 일반관리비·기업이윤 각 5%(지혜의영토 귀속), 공급가액 만원 미만 절사</w:t>
             </w:r>
           </w:p>
         </w:tc>
@@ -2151,7 +2153,7 @@
           </w:tcPr>
           <w:p>
             <w:r>
-              <w:t>30,560,000원 + VAT = 33,616,000원</w:t>
+              <w:t>32,810,000원 + VAT = 36,091,000원</w:t>
             </w:r>
           </w:p>
         </w:tc>

</xml_diff>

<commit_message>
Raise quotation using 2025 foundation townhall settlement and unit prices
- 인건비: 근거 없는 투입일수(5일/8일) 대신 '25.11.25 재단 제출 회당 단가 적용
- '25.10.22 간담회 정산 실적 반영: 다과·제작물·포토존·소모품 상향, 통천·연출소품 추가
- 행사보험·결과보고서 추가, 출장비 지역별 산출
- 내부용 산출근거(2025 실적 비교) 별도 파일

Co-Authored-By: Claude Opus 5.5 <noreply@anthropic.com>
Claude-Session: https://claude.ai/code/session_018WmVGxh2eujqtEGBBBdyNp
</commit_message>
<xml_diff>
--- a/2026_취약노동자원탁회의_결과보고회/업무분장표_마마미디어_코리아스픽스.docx
+++ b/2026_취약노동자원탁회의_결과보고회/업무분장표_마마미디어_코리아스픽스.docx
@@ -2079,7 +2079,7 @@
           </w:tcPr>
           <w:p>
             <w:r>
-              <w:t>통합견적 18,190,000원(VAT 포함) + 이관 제작물 2,717,000원(VAT 포함, 추정) — 마마미디어 재견적 필요</w:t>
+              <w:t>통합견적 18,190,000원(VAT 포함) + 이관·상향 제작물 4,811,000원(VAT 포함, '25 정산 실적 기준) — 마마미디어 재견적 필요</w:t>
             </w:r>
           </w:p>
         </w:tc>
@@ -2089,7 +2089,7 @@
           </w:tcPr>
           <w:p>
             <w:r>
-              <w:t>20,907,000원 (VAT 포함 기준)</w:t>
+              <w:t>23,001,000원 (VAT 포함 기준)</w:t>
             </w:r>
           </w:p>
         </w:tc>
@@ -2111,7 +2111,7 @@
           </w:tcPr>
           <w:p>
             <w:r>
-              <w:t>인건비(총괄책임자·기획운영·참가자관리) 6,400,000 + 시스템·접수·홍보·출장 2,460,000</w:t>
+              <w:t>인건비(PM·운영인력·참여단 관리, '25.11.25 재단 제출 단가) 7,080,000 + 시스템·접수·홍보·출장·보험·보고서 3,710,000</w:t>
             </w:r>
           </w:p>
         </w:tc>
@@ -2121,7 +2121,7 @@
           </w:tcPr>
           <w:p>
             <w:r>
-              <w:t>8,860,000원 (VAT 별도)</w:t>
+              <w:t>10,790,000원 (VAT 별도)</w:t>
             </w:r>
           </w:p>
         </w:tc>
@@ -2143,7 +2143,7 @@
           </w:tcPr>
           <w:p>
             <w:r>
-              <w:t>직접비 29,767,000 + 일반관리비·기업이윤 각 5%(지혜의영토 귀속), 공급가액 만원 미만 절사</w:t>
+              <w:t>직접비 33,791,000 + 일반관리비·기업이윤 각 5%(지혜의영토 귀속), 공급가액 만원 미만 절사</w:t>
             </w:r>
           </w:p>
         </w:tc>
@@ -2153,7 +2153,7 @@
           </w:tcPr>
           <w:p>
             <w:r>
-              <w:t>32,810,000원 + VAT = 36,091,000원</w:t>
+              <w:t>37,250,000원 + VAT = 40,975,000원</w:t>
             </w:r>
           </w:p>
         </w:tc>

</xml_diff>

<commit_message>
Trim quotation scope per review
- 대관료(실비정산) 제외, 통천 현수막·현장 연출 소품·온라인 모집 삭제(과업내용서 미기재)
- 기획·운영 총괄을 PM + 운영 인력 3인(마마미디어 1인 포함)으로 정리
- 참여단 관리 50명 규모 비례 조정, 접수 인력 '25 단가 적용, 결과보고서 상향

Co-Authored-By: Claude Opus 5.5 <noreply@anthropic.com>
Claude-Session: https://claude.ai/code/session_018WmVGxh2eujqtEGBBBdyNp
</commit_message>
<xml_diff>
--- a/2026_취약노동자원탁회의_결과보고회/업무분장표_마마미디어_코리아스픽스.docx
+++ b/2026_취약노동자원탁회의_결과보고회/업무분장표_마마미디어_코리아스픽스.docx
@@ -450,7 +450,7 @@
           </w:tcPr>
           <w:p>
             <w:r>
-              <w:t>행사장 대관(예산 150만원/회)</w:t>
+              <w:t>행사장 대관 협의·예약 지원</w:t>
             </w:r>
           </w:p>
         </w:tc>
@@ -486,7 +486,7 @@
           </w:tcPr>
           <w:p>
             <w:r>
-              <w:t>재단 직접 계약 시 제외</w:t>
+              <w:t>대관료는 실비 정산(견적 제외)</w:t>
             </w:r>
           </w:p>
         </w:tc>
@@ -1366,7 +1366,7 @@
           </w:tcPr>
           <w:p>
             <w:r>
-              <w:t>현장 운영 PM, 현장 운영 보조(마이크 전달 등)</w:t>
+              <w:t>운영 인력(3인 중 1인), 현장 운영 보조(마이크 전달 등)</w:t>
             </w:r>
           </w:p>
         </w:tc>
@@ -1392,7 +1392,7 @@
               <w:jc w:val="center"/>
             </w:pPr>
             <w:r>
-              <w:t>-</w:t>
+              <w:t>●</w:t>
             </w:r>
           </w:p>
         </w:tc>
@@ -1401,7 +1401,9 @@
             <w:tcW w:type="dxa" w:w="2494"/>
           </w:tcPr>
           <w:p>
-            <w:r/>
+            <w:r>
+              <w:t>운영 인력 3인: 마마미디어 1·코리아스픽스 2</w:t>
+            </w:r>
           </w:p>
         </w:tc>
       </w:tr>
@@ -2079,7 +2081,7 @@
           </w:tcPr>
           <w:p>
             <w:r>
-              <w:t>통합견적 18,190,000원(VAT 포함) + 이관·상향 제작물 4,811,000원(VAT 포함, '25 정산 실적 기준) — 마마미디어 재견적 필요</w:t>
+              <w:t>통합견적 18,190,000원에서 대관료 3,638,000원 제외, 현장PM→운영인력 1인(−278,000), 제작물 이관·상향 반영 — 마마미디어 재견적 필요</w:t>
             </w:r>
           </w:p>
         </w:tc>
@@ -2089,7 +2091,7 @@
           </w:tcPr>
           <w:p>
             <w:r>
-              <w:t>23,001,000원 (VAT 포함 기준)</w:t>
+              <w:t>17,875,000원 (VAT 포함 기준)</w:t>
             </w:r>
           </w:p>
         </w:tc>
@@ -2111,7 +2113,7 @@
           </w:tcPr>
           <w:p>
             <w:r>
-              <w:t>인건비(PM·운영인력·참여단 관리, '25.11.25 재단 제출 단가) 7,080,000 + 시스템·접수·홍보·출장·보험·보고서 3,710,000</w:t>
+              <w:t>인건비(PM·운영인력 2인, '25.11.25 재단 제출 단가) 4,680,000 + 참여단 관리·접수·시스템·출장·보험·결과보고서 4,310,000</w:t>
             </w:r>
           </w:p>
         </w:tc>
@@ -2121,7 +2123,7 @@
           </w:tcPr>
           <w:p>
             <w:r>
-              <w:t>10,790,000원 (VAT 별도)</w:t>
+              <w:t>8,990,000원 (VAT 별도)</w:t>
             </w:r>
           </w:p>
         </w:tc>
@@ -2143,7 +2145,7 @@
           </w:tcPr>
           <w:p>
             <w:r>
-              <w:t>직접비 33,791,000 + 일반관리비·기업이윤 각 5%(지혜의영토 귀속), 공급가액 만원 미만 절사</w:t>
+              <w:t>직접비 26,865,000 + 일반관리비·기업이윤 각 5%(지혜의영토 귀속), 공급가액 만원 미만 절사</w:t>
             </w:r>
           </w:p>
         </w:tc>
@@ -2153,7 +2155,7 @@
           </w:tcPr>
           <w:p>
             <w:r>
-              <w:t>37,250,000원 + VAT = 40,975,000원</w:t>
+              <w:t>29,610,000원 + VAT = 32,571,000원</w:t>
             </w:r>
           </w:p>
         </w:tc>

</xml_diff>

<commit_message>
Align quotation with Mama Media revised quote and draft reply email
- 마마미디어 수정견적(10.20, 20,610,000원) 기준 환산단가(올림) 적용
- 명패 50개·배너·폼보드·명찰 단가, 운영 인력 85만원(마마 PM 이상)으로 조정
- 김잔디 위원 회신 메일 초안 추가

Co-Authored-By: Claude Opus 5.5 <noreply@anthropic.com>
Claude-Session: https://claude.ai/code/session_018WmVGxh2eujqtEGBBBdyNp
</commit_message>
<xml_diff>
--- a/2026_취약노동자원탁회의_결과보고회/업무분장표_마마미디어_코리아스픽스.docx
+++ b/2026_취약노동자원탁회의_결과보고회/업무분장표_마마미디어_코리아스픽스.docx
@@ -2081,7 +2081,7 @@
           </w:tcPr>
           <w:p>
             <w:r>
-              <w:t>통합견적 18,190,000원에서 대관료 3,638,000원 제외, 현장PM→운영인력 1인(−278,000), 제작물 이관·상향 반영 — 마마미디어 재견적 필요</w:t>
+              <w:t>수정견적(10.20) 20,610,000원 기준, 대관료 제외 후 항목별 마마 금액 이상 반영(현장PM→운영인력 1인 1,700,000원 포함)</w:t>
             </w:r>
           </w:p>
         </w:tc>
@@ -2091,7 +2091,7 @@
           </w:tcPr>
           <w:p>
             <w:r>
-              <w:t>17,875,000원 (VAT 포함 기준)</w:t>
+              <w:t>19,121,000원 (VAT 포함 기준)</w:t>
             </w:r>
           </w:p>
         </w:tc>
@@ -2113,7 +2113,7 @@
           </w:tcPr>
           <w:p>
             <w:r>
-              <w:t>인건비(PM·운영인력 2인, '25.11.25 재단 제출 단가) 4,680,000 + 참여단 관리·접수·시스템·출장·보험·결과보고서 4,310,000</w:t>
+              <w:t>인건비(PM 920,000·운영인력 2인 850,000, 2회) 5,240,000 + 참여단 관리·접수·시스템·출장·보험·결과보고서 4,310,000</w:t>
             </w:r>
           </w:p>
         </w:tc>
@@ -2123,7 +2123,7 @@
           </w:tcPr>
           <w:p>
             <w:r>
-              <w:t>8,990,000원 (VAT 별도)</w:t>
+              <w:t>9,550,000원 (VAT 별도)</w:t>
             </w:r>
           </w:p>
         </w:tc>
@@ -2145,7 +2145,7 @@
           </w:tcPr>
           <w:p>
             <w:r>
-              <w:t>직접비 26,865,000 + 일반관리비·기업이윤 각 5%(지혜의영토 귀속), 공급가액 만원 미만 절사</w:t>
+              <w:t>직접비 28,671,000 + 일반관리비·기업이윤 각 5%(지혜의영토 귀속), 공급가액 만원 미만 절사</w:t>
             </w:r>
           </w:p>
         </w:tc>
@@ -2155,7 +2155,7 @@
           </w:tcPr>
           <w:p>
             <w:r>
-              <w:t>29,610,000원 + VAT = 32,571,000원</w:t>
+              <w:t>31,600,000원 + VAT = 34,760,000원</w:t>
             </w:r>
           </w:p>
         </w:tc>

</xml_diff>